<commit_message>
Present as a project report, not a manuscript; date the current-population rate
- Remove "manuscript in preparation / not yet submitted for publication" wording;
  rename SPHEREx_combined_manuscript.docx to SPHEREx_combined_report.docx.
- Replace "today" with "as of September 2026" for the 0.24 trails/exposure rate,
  since it depends on in-orbit counts that keep growing.
- Rename results keys today/today_counts to rate_sep2026/counts_sep2026.

Co-Authored-By: Claude Opus 5.5 <noreply@anthropic.com>
Claude-Session: https://claude.ai/code/session_014qQVnFoxJUPW3kMxQRAzKJ
</commit_message>
<xml_diff>
--- a/SPHEREx_extension_report.docx
+++ b/SPHEREx_extension_report.docx
@@ -76,7 +76,7 @@
           <w:sz w:val="21"/>
           <w:szCs w:val="21"/>
         </w:rPr>
-        <w:t xml:space="preserve">This report is separate from the undergraduate thesis “Investigation on Celestial Events and Megaconstellation Effects on Telescopes” (SRM Institute of Science and Technology, April 2026, supervised by Dr. Tushar H. Rana), which used a reflectivity-based surface-brightness model for four representative satellites and did not include orbital propagation, Monte Carlo statistics, blackbody modelling or TLE error analysis. Everything below was computed afterwards, from real orbital data. Section numbers follow the combined manuscript.</w:t>
+        <w:t xml:space="preserve">This report is separate from the undergraduate thesis “Investigation on Celestial Events and Megaconstellation Effects on Telescopes” (SRM Institute of Science and Technology, April 2026, supervised by Dr. Tushar H. Rana), which used a reflectivity-based surface-brightness model for four representative satellites and did not include orbital propagation, Monte Carlo statistics, blackbody modelling or TLE error analysis. Everything below was computed afterwards, from real orbital data. Section numbers follow the combined project report.</w:t>
       </w:r>
     </w:p>
     <w:p>
@@ -153,7 +153,7 @@
         </w:rPr>
       </w:pPr>
       <w:r>
-        <w:t xml:space="preserve">Full-build-out prediction revised from 64.9 (first version) and 4.5 (previous revision, which had a fixed field roll and a single date) to 5.9 ± 0.1 trails/exposure (Borlaff et al.: 5.64). Today's rate is ~0.24; the earliest ~2.3 figure is withdrawn.</w:t>
+        <w:t xml:space="preserve">Full-build-out prediction revised from 64.9 (first version) and 4.5 (previous revision, which had a fixed field roll and a single date) to 5.9 ± 0.1 trails/exposure (Borlaff et al.: 5.64). The rate as of September 2026 is ~0.24; the earliest ~2.3 figure is withdrawn.</w:t>
       </w:r>
     </w:p>
     <w:p>
@@ -532,7 +532,7 @@
           <w:sz w:val="21"/>
           <w:szCs w:val="21"/>
         </w:rPr>
-        <w:t xml:space="preserve">The investigation also invalidates a headline figure from the earliest version of this work, ~2.3 trails per exposure for today's population “at a representative sky pointing”. That rate came from the fixed North Ecliptic Pole boresight: at all 36 real crossings behind it the pole was 101–164° from SPHEREx's zenith, a direction SPHEREx never points, and about 80% of it came from Starlink, which SPHEREx cannot see (§7.3). The figure is withdrawn and replaced by §7.5.</w:t>
+        <w:t xml:space="preserve">The investigation also invalidates a headline figure from the earliest version of this work, ~2.3 trails per exposure for the current population “at a representative sky pointing”. That rate came from the fixed North Ecliptic Pole boresight: at all 36 real crossings behind it the pole was 101–164° from SPHEREx's zenith, a direction SPHEREx never points, and about 80% of it came from Starlink, which SPHEREx cannot see (§7.3). The figure is withdrawn and replaced by §7.5.</w:t>
       </w:r>
     </w:p>
     <w:p>
@@ -553,7 +553,7 @@
           <w:sz w:val="21"/>
           <w:szCs w:val="21"/>
         </w:rPr>
-        <w:t xml:space="preserve">With the boresight within 35° of zenith, every line of sight inside the field stays well below 90° from local vertical during the exposure, so it climbs monotonically away from Earth and can only intersect orbits higher than SPHEREx's own. The simulation confirms this: the four below-orbit control shells (Starlink 550 and 530 km, Amazon Leo 630 km, Guowang GW-A59 590 km) produced 0 crossings in about 4.8 million valid exposures. Most satellites in orbit today are Starlink, so most of today's satellite population is invisible to SPHEREx's survey.</w:t>
+        <w:t xml:space="preserve">With the boresight within 35° of zenith, every line of sight inside the field stays well below 90° from local vertical during the exposure, so it climbs monotonically away from Earth and can only intersect orbits higher than SPHEREx's own. The simulation confirms this: the four below-orbit control shells (Starlink 550 and 530 km, Amazon Leo 630 km, Guowang GW-A59 590 km) produced 0 crossings in about 4.8 million valid exposures. Most satellites in orbit as of September 2026 are Starlink, so most of the current satellite population is invisible to SPHEREx's survey.</w:t>
       </w:r>
     </w:p>
     <w:p>
@@ -1372,19 +1372,19 @@
         <w:spacing w:after="120" w:before="240"/>
       </w:pPr>
       <w:r>
-        <w:t xml:space="preserve">7.5 Today's population</w:t>
-      </w:r>
-    </w:p>
-    <w:p>
-      <w:pPr>
-        <w:spacing w:after="160"/>
-      </w:pPr>
-      <w:r>
-        <w:rPr>
-          <w:sz w:val="21"/>
-          <w:szCs w:val="21"/>
-        </w:rPr>
-        <w:t xml:space="preserve">Three constellations have satellites above SPHEREx today: OneWeb (654), Guowang GW-2 (186) and Qianfan (~248) (KeepTrack, Orbital Radar, Aug–Sep 2026; Guowang split evenly between its two inclinations). Together they give about 0.24 trails per exposure, so roughly one SPHEREx exposure in four carries a trail, about two thirds of them from OneWeb. The ~9,400 Starlink and ~200 Amazon Leo satellites contribute nothing under SPHEREx's survey geometry. [17_summarise_results.py]</w:t>
+        <w:t xml:space="preserve">7.5 The population as of September 2026</w:t>
+      </w:r>
+    </w:p>
+    <w:p>
+      <w:pPr>
+        <w:spacing w:after="160"/>
+      </w:pPr>
+      <w:r>
+        <w:rPr>
+          <w:sz w:val="21"/>
+          <w:szCs w:val="21"/>
+        </w:rPr>
+        <w:t xml:space="preserve">As of September 2026, three constellations have satellites above SPHEREx: OneWeb (654), Guowang GW-2 (186) and Qianfan (~248) (KeepTrack, Orbital Radar, Aug–Sep 2026; Guowang split evenly between its two inclinations). Together they give about 0.24 trails per exposure, so roughly one SPHEREx exposure in four carries a trail, about two thirds of them from OneWeb. The ~9,400 Starlink and ~200 Amazon Leo satellites contribute nothing under SPHEREx's survey geometry. [17_summarise_results.py]</w:t>
       </w:r>
     </w:p>
     <w:p>
@@ -2207,7 +2207,7 @@
           <w:sz w:val="21"/>
           <w:szCs w:val="21"/>
         </w:rPr>
-        <w:t xml:space="preserve">SPHEREx's own survey rules are its best defence against megaconstellations. Because it only points within 35° of zenith, every satellite orbiting below it, including all of Starlink and Amazon Leo, is geometrically invisible. Its exposure is set by the smaller population of high-altitude constellations: about 0.24 trails per exposure today (one exposure in four), rising to 5.9 ± 0.1 if the filed high-altitude constellations are completed. That is consistent with the 5.64 published by Borlaff et al. (2025), with the caveat that the future number depends mainly on how much of Qianfan is actually built.</w:t>
+        <w:t xml:space="preserve">SPHEREx's own survey rules are its best defence against megaconstellations. Because it only points within 35° of zenith, every satellite orbiting below it, including all of Starlink and Amazon Leo, is geometrically invisible. Its exposure is set by the smaller population of high-altitude constellations: about 0.24 trails per exposure as of September 2026 (one exposure in four), rising to 5.9 ± 0.1 if the filed high-altitude constellations are completed. That is consistent with the 5.64 published by Borlaff et al. (2025), with the caveat that the future number depends mainly on how much of Qianfan is actually built.</w:t>
       </w:r>
     </w:p>
     <w:p>

</xml_diff>